<commit_message>
Marcius Melhem: revisão da Parte 4
Co-Authored-By: Claude Opus 5.5 <noreply@anthropic.com>
Claude-Session: https://claude.ai/code/session_01MJjUEEZrxQDEUifKK2vj9g
</commit_message>
<xml_diff>
--- a/roteiros/marcius-melhem/Melhem_Parte4.docx
+++ b/roteiros/marcius-melhem/Melhem_Parte4.docx
@@ -23,7 +23,7 @@
         <w:rPr>
           <w:color w:val="000000"/>
         </w:rPr>
-        <w:t>Oito meses depois da primeira reportagem, a piauí tinha uma segunda pronta. Novos relatos, novas mulheres, novos detalhes.</w:t>
+        <w:t>Oito meses depois da primeira reportagem, a piauí tinha uma segunda pronta. Com relatos de outras mulheres, que ainda não tinham aparecido.</w:t>
       </w:r>
     </w:p>
     <w:p>
@@ -55,7 +55,7 @@
         <w:rPr>
           <w:color w:val="000000"/>
         </w:rPr>
-        <w:t>A punição para quem desobedecesse era pesada. Multa de quinhentos mil reais. Recolhimento dos exemplares das bancas. Retirada da reportagem do site.</w:t>
+        <w:t>A punição para quem desobedecesse era pesada. Multa de quinhentos mil reais, e a ordem de recolher das bancas os exemplares que trouxessem o texto.</w:t>
       </w:r>
     </w:p>
     <w:p>
@@ -71,7 +71,7 @@
         <w:rPr>
           <w:color w:val="000000"/>
         </w:rPr>
-        <w:t>Jornalistas e entidades de imprensa chamaram aquilo pelo nome. Censura prévia.</w:t>
+        <w:t>Para muitos jornalistas, aquilo tinha nome. Censura prévia.</w:t>
       </w:r>
     </w:p>
     <w:p>
@@ -199,7 +199,7 @@
         <w:rPr>
           <w:color w:val="000000"/>
         </w:rPr>
-        <w:t>No YouTube, ele publicou vídeos e mais vídeos sobre o caso. Mais de cem, ao longo dos anos. Neles, contestava as acusações, mostrava documentos, comentava depoimentos e falava das mulheres que o acusavam.</w:t>
+        <w:t>No YouTube, ele publicou vídeos e mais vídeos sobre o caso. Mais de cem, ao longo dos anos. Neles, contestava as acusações e falava das mulheres que o acusavam.</w:t>
       </w:r>
     </w:p>
     <w:p>
@@ -367,7 +367,7 @@
         <w:rPr>
           <w:color w:val="000000"/>
         </w:rPr>
-        <w:t>Imagine o que isso significa para quem fez a denúncia. Você conta a sua história para a empresa, para a polícia, para o Ministério Público. Espera anos. E descobre que o prazo para alguém responder por ela acabou enquanto o processo andava.</w:t>
+        <w:t>Imagine o que isso significa para quem fez a denúncia. Você conta a sua história para a empresa e para a polícia. Espera anos. E descobre que o prazo para alguém responder por ela acabou enquanto o processo andava.</w:t>
       </w:r>
     </w:p>
     <w:p>
@@ -471,7 +471,7 @@
         <w:rPr>
           <w:color w:val="000000"/>
         </w:rPr>
-        <w:t>A juíza recusou. O processo seguiu, e as audiências foram marcadas para a primeira semana de agosto. Seria a primeira vez que acusação e defesa iam se encontrar diante da juíza para discutir o caso.</w:t>
+        <w:t>A juíza recusou. O processo seguiu, e as audiências foram marcadas para a primeira semana de agosto. Era a audiência em que acusação e defesa seriam ouvidas diante da juíza.</w:t>
       </w:r>
     </w:p>
     <w:p>
@@ -527,7 +527,7 @@
         <w:rPr>
           <w:color w:val="1F4EB4"/>
         </w:rPr>
-        <w:t>A audiência de agosto, aquela em que acusação e defesa finalmente iam se encontrar diante da juíza, foi retirada da agenda.</w:t>
+        <w:t>A audiência de agosto, aquela em que acusação e defesa seriam ouvidas diante da juíza, foi retirada da agenda.</w:t>
       </w:r>
     </w:p>
     <w:p>

</xml_diff>

<commit_message>
Marcius Melhem: Parte 4
Co-Authored-By: Claude Opus 5.5 <noreply@anthropic.com>
Claude-Session: https://claude.ai/code/session_01MJjUEEZrxQDEUifKK2vj9g
</commit_message>
<xml_diff>
--- a/roteiros/marcius-melhem/Melhem_Parte4.docx
+++ b/roteiros/marcius-melhem/Melhem_Parte4.docx
@@ -7,7 +7,7 @@
         <w:pStyle w:val="Heading1"/>
       </w:pPr>
       <w:r>
-        <w:t>Assim FOI a VIDA de MARCIUS MELHEM: O Escândalo Que A Globo Não Conseguiu Abafar — Parte 4</w:t>
+        <w:t>MARCIUS MELHEM: O Escândalo Que a Globo Nunca Explicou — Parte 4</w:t>
       </w:r>
     </w:p>
     <w:p>
@@ -15,7 +15,7 @@
         <w:rPr>
           <w:color w:val="000000"/>
         </w:rPr>
-        <w:t>Agosto de dois mil e vinte e um.</w:t>
+        <w:t>A reportagem tinha saído numa sexta-feira. Naquele mesmo fim de semana, o caso deixou as páginas de cultura e virou assunto nacional.</w:t>
       </w:r>
     </w:p>
     <w:p>
@@ -23,7 +23,7 @@
         <w:rPr>
           <w:color w:val="000000"/>
         </w:rPr>
-        <w:t>Oito meses depois da primeira reportagem, a piauí tinha uma segunda pronta. Com relatos de outras mulheres, que ainda não tinham aparecido.</w:t>
+        <w:t>Nas redes sociais, o nome de Marcius Melhem estava em todo lugar.</w:t>
       </w:r>
     </w:p>
     <w:p>
@@ -31,7 +31,7 @@
         <w:rPr>
           <w:color w:val="000000"/>
         </w:rPr>
-        <w:t>Melhem foi à Justiça para impedir que ela saísse.</w:t>
+        <w:t>Marcelo Adnet foi um dos primeiros a se manifestar. No mesmo dia da reportagem, escreveu que não tinha falado antes porque as vítimas tinham pedido sigilo. Disse que tinha agido e respeitado esse pedido. E deixou claro que estava ao lado delas.</w:t>
       </w:r>
     </w:p>
     <w:p>
@@ -39,7 +39,7 @@
         <w:rPr>
           <w:color w:val="000000"/>
         </w:rPr>
-        <w:t>No dia doze de agosto, a juíza Tula Corrêa de Mello, da Vigésima Vara Criminal do Rio de Janeiro, atendeu ao pedido dele.</w:t>
+        <w:t>Só que havia um detalhe que muita gente lembrou na hora.</w:t>
       </w:r>
     </w:p>
     <w:p>
@@ -47,7 +47,7 @@
         <w:rPr>
           <w:color w:val="000000"/>
         </w:rPr>
-        <w:t>A decisão proibia a revista de publicar a nova reportagem enquanto durassem as investigações. Segundo a juíza, a revista tinha violado o sigilo do processo ao preparar o texto.</w:t>
+        <w:t>Poucos meses antes, em agosto, Adnet tinha sido entrevistado no Roda Viva. Perguntado sobre o caso, disse que assédio era inaceitável, mas que não tinha poder de polícia, e que a posição dele era de dúvida.</w:t>
       </w:r>
     </w:p>
     <w:p>
@@ -55,7 +55,7 @@
         <w:rPr>
           <w:color w:val="000000"/>
         </w:rPr>
-        <w:t>A punição para quem desobedecesse era pesada. Multa de quinhentos mil reais, e a ordem de recolher das bancas os exemplares que trouxessem o texto.</w:t>
+        <w:t>Para uns, era a prova de que ele estava protegendo as mulheres que tinham pedido silêncio. Para outros, era uma mudança de tom difícil de explicar.</w:t>
       </w:r>
     </w:p>
     <w:p>
@@ -63,7 +63,7 @@
         <w:rPr>
           <w:color w:val="000000"/>
         </w:rPr>
-        <w:t>Pense no que isso significa num país como o Brasil. Uma revista proibida, por ordem judicial, de publicar uma reportagem antes mesmo de ela sair.</w:t>
+        <w:t>No dia seguinte, a história chegou a Brasília.</w:t>
       </w:r>
     </w:p>
     <w:p>
@@ -71,7 +71,7 @@
         <w:rPr>
           <w:color w:val="000000"/>
         </w:rPr>
-        <w:t>Para muitos jornalistas, aquilo tinha nome. Censura prévia.</w:t>
+        <w:t>O deputado Eduardo Bolsonaro publicou que a Globo tinha protegido Marcius Melhem. Outros políticos, entre eles o então ministro das Comunicações, Fábio Faria, também comentaram o caso.</w:t>
       </w:r>
     </w:p>
     <w:p>
@@ -79,7 +79,7 @@
         <w:rPr>
           <w:color w:val="000000"/>
         </w:rPr>
-        <w:t>Durante meses, a reportagem ficou pronta, guardada, sem poder chegar às bancas. Os leitores sabiam que ela existia. Só não podiam ler.</w:t>
+        <w:t>Um escândalo de bastidores da televisão tinha virado munição na briga política entre o governo e a maior emissora do país.</w:t>
       </w:r>
     </w:p>
     <w:p>
@@ -87,7 +87,7 @@
         <w:rPr>
           <w:color w:val="C00000"/>
         </w:rPr>
-        <w:t>Lembre do título deste vídeo. O escândalo que a Globo não conseguiu abafar. Agora a tentativa de silêncio vinha de outro lugar. E ela durou cento e setenta e dois dias.</w:t>
+        <w:t>Guarde isso. A partir daquele fim de semana, quase ninguém discutia mais só o que tinha acontecido dentro do departamento de humor. Cada lado tinha um motivo para torcer por uma versão. E, no meio dessa barulheira, a pergunta principal continuava sem resposta.</w:t>
       </w:r>
     </w:p>
     <w:p>
@@ -95,7 +95,7 @@
         <w:rPr>
           <w:color w:val="000000"/>
         </w:rPr>
-        <w:t>A revista recorreu.</w:t>
+        <w:t>No meio artístico, as reações também se dividiram.</w:t>
       </w:r>
     </w:p>
     <w:p>
@@ -103,7 +103,7 @@
         <w:rPr>
           <w:color w:val="000000"/>
         </w:rPr>
-        <w:t>O caso subiu até o Supremo Tribunal Federal, a mais alta corte do país.</w:t>
+        <w:t>O youtuber Felipe Castanhari, amigo de Dani, publicou que Melhem era um criminoso e merecia prisão. Melhem processou. Em primeira instância, a Justiça de São Paulo condenou Castanhari a pagar cem mil reais de indenização ao ex-diretor. A defesa do youtuber anunciou recurso e disse que ele estava apenas defendendo uma amiga.</w:t>
       </w:r>
     </w:p>
     <w:p>
@@ -111,7 +111,7 @@
         <w:rPr>
           <w:color w:val="000000"/>
         </w:rPr>
-        <w:t>O pedido caiu nas mãos do ministro Gilmar Mendes.</w:t>
+        <w:t>Do outro lado, a atriz Letícia Spiller disse numa entrevista que ele estava virando um mártir. Disse que ele tinha bom coração e que nunca o tinha visto agir de forma agressiva.</w:t>
       </w:r>
     </w:p>
     <w:p>
@@ -119,7 +119,7 @@
         <w:rPr>
           <w:color w:val="000000"/>
         </w:rPr>
-        <w:t>A decisão dele foi clara. Censura prévia à imprensa viola a Constituição. A revista podia publicar.</w:t>
+        <w:t>A reação foi imediata. Ainda em dezembro, Spiller pediu desculpas a Dani Calabresa publicamente e afirmou que nunca tinha apoiado assédio.</w:t>
       </w:r>
     </w:p>
     <w:p>
@@ -127,7 +127,7 @@
         <w:rPr>
           <w:color w:val="000000"/>
         </w:rPr>
-        <w:t>Na segunda-feira, catorze de fevereiro de dois mil e vinte e dois, depois de cento e setenta e dois dias de proibição, a segunda reportagem finalmente saiu.</w:t>
+        <w:t>Falar daquele caso tinha virado um campo minado.</w:t>
       </w:r>
     </w:p>
     <w:p>
@@ -135,7 +135,7 @@
         <w:rPr>
           <w:color w:val="000000"/>
         </w:rPr>
-        <w:t>O que ela trazia era ainda mais pesado do que a primeira.</w:t>
+        <w:t>Enquanto isso, a defesa de Melhem preparava a resposta mais forte que ele tinha.</w:t>
       </w:r>
     </w:p>
     <w:p>
@@ -143,7 +143,7 @@
         <w:rPr>
           <w:color w:val="000000"/>
         </w:rPr>
-        <w:t>Segundo a revista, novos relatos de mulheres que trabalharam com Melhem tinham chegado à investigação. Um deles, de uma atriz, afirmava que ele tinha exigido dela sexo oral.</w:t>
+        <w:t>Dezembro de dois mil e vinte. Menos de duas semanas depois da reportagem.</w:t>
       </w:r>
     </w:p>
     <w:p>
@@ -151,7 +151,7 @@
         <w:rPr>
           <w:color w:val="000000"/>
         </w:rPr>
-        <w:t>A lista de mulheres que tinham procurado a Justiça para falar de Melhem já chegava a oito. Uma delas, a atriz Suzana Pires, depois esclareceu que tinha sido apenas testemunha. Ficaram sete.</w:t>
+        <w:t>Os advogados de Melhem enviaram uma notificação extrajudicial a Dani Calabresa. E, junto com ela, apresentaram algo que ninguém tinha visto até então.</w:t>
       </w:r>
     </w:p>
     <w:p>
@@ -159,7 +159,7 @@
         <w:rPr>
           <w:color w:val="000000"/>
         </w:rPr>
-        <w:t>Sete mulheres. O mesmo número que você ouviu no começo deste vídeo.</w:t>
+        <w:t>Mensagens de celular.</w:t>
       </w:r>
     </w:p>
     <w:p>
@@ -167,7 +167,15 @@
         <w:rPr>
           <w:color w:val="000000"/>
         </w:rPr>
-        <w:t>Melhem, mais uma vez, negou tudo.</w:t>
+        <w:t>Conversas de WhatsApp trocadas entre os dois entre dois mil e dezessete e dois mil e dezenove. Justamente o período em que, segundo a reportagem, Dani dizia ter sofrido assédio.</w:t>
+      </w:r>
+    </w:p>
+    <w:p>
+      <w:r>
+        <w:rPr>
+          <w:color w:val="C00000"/>
+        </w:rPr>
+        <w:t>E uma delas chamou a atenção mais do que todas as outras. Porque tinha sido enviada poucos dias depois da festa onde, segundo o relato de Dani, tinha acontecido o episódio mais grave de todos.</w:t>
       </w:r>
     </w:p>
     <w:p>
@@ -175,7 +183,79 @@
         <w:rPr>
           <w:color w:val="000000"/>
         </w:rPr>
-        <w:t>Dessa vez, porém, ele não estava mais esperando os jornais.</w:t>
+        <w:t>Segundo a defesa de Melhem, era uma mensagem de voz enviada por Dani em doze de novembro de dois mil e dezessete. Oito dias depois da confraternização. No áudio, segundo a Folha de S.Paulo, que teve acesso ao material, ela agradecia uma mensagem que ele tinha mandado no grupo do Zorra, falava da admiração que tinha pelo trabalho dele, e dizia estar animada com uma viagem que fariam juntos.</w:t>
+      </w:r>
+    </w:p>
+    <w:p>
+      <w:r>
+        <w:rPr>
+          <w:color w:val="000000"/>
+        </w:rPr>
+        <w:t>Para a defesa, aquilo provava que a relação entre os dois continuou amigável e profissional durante anos. Os advogados disseram que estavam mostrando só um trecho, para não expor ninguém, e que tinham contratado uma empresa de perícia para preservar as conversas.</w:t>
+      </w:r>
+    </w:p>
+    <w:p>
+      <w:r>
+        <w:rPr>
+          <w:color w:val="000000"/>
+        </w:rPr>
+        <w:t>A resposta veio da advogada Mayra Cotta.</w:t>
+      </w:r>
+    </w:p>
+    <w:p>
+      <w:r>
+        <w:rPr>
+          <w:color w:val="000000"/>
+        </w:rPr>
+        <w:t>Segundo ela, divulgar mensagens daquele jeito era uma estratégia comum em casos parecidos. O objetivo, na visão dela, era intimidar a mulher que denunciava, as outras vítimas que seguiam protegidas pelo anonimato, e as testemunhas.</w:t>
+      </w:r>
+    </w:p>
+    <w:p>
+      <w:r>
+        <w:rPr>
+          <w:color w:val="000000"/>
+        </w:rPr>
+        <w:t>Ela também afirmou que a reportagem tinha sido checada com dezenas de pessoas.</w:t>
+      </w:r>
+    </w:p>
+    <w:p>
+      <w:r>
+        <w:rPr>
+          <w:color w:val="000000"/>
+        </w:rPr>
+        <w:t>De um lado, um áudio carinhoso. Do outro, a explicação de que mensagens gentis não provam nada sobre o que acontece quando uma mulher depende do chefe.</w:t>
+      </w:r>
+    </w:p>
+    <w:p>
+      <w:r>
+        <w:rPr>
+          <w:color w:val="000000"/>
+        </w:rPr>
+        <w:t>O Brasil ficou dividido.</w:t>
+      </w:r>
+    </w:p>
+    <w:p>
+      <w:r>
+        <w:rPr>
+          <w:color w:val="000000"/>
+        </w:rPr>
+        <w:t>Pense nisso por um momento. Você já foi simpático com alguém de quem tinha medo? Já respondeu com educação a uma pessoa só porque ela mandava no seu emprego?</w:t>
+      </w:r>
+    </w:p>
+    <w:p>
+      <w:r>
+        <w:rPr>
+          <w:color w:val="000000"/>
+        </w:rPr>
+        <w:t>Essa era exatamente a pergunta que o caso colocava na mesa.</w:t>
+      </w:r>
+    </w:p>
+    <w:p>
+      <w:r>
+        <w:rPr>
+          <w:color w:val="000000"/>
+        </w:rPr>
+        <w:t>Dani ia responder a ela, com as próprias palavras, diante de um juiz.</w:t>
       </w:r>
     </w:p>
     <w:p>
@@ -183,7 +263,7 @@
         <w:rPr>
           <w:color w:val="C00000"/>
         </w:rPr>
-        <w:t>Repare no que ele fez a seguir. Porque essa decisão, tomada para se defender, ia virar anos depois um novo processo contra ele. E ia colocar quatro atrizes de novo diante de um juiz.</w:t>
+        <w:t>Só que, antes disso, Marcius Melhem ia dar um passo que transformou a troca de notas numa guerra nos tribunais. E ia acusar Dani Calabresa de algo que deixou muita gente de boca aberta.</w:t>
       </w:r>
     </w:p>
     <w:p>
@@ -191,7 +271,7 @@
         <w:rPr>
           <w:color w:val="000000"/>
         </w:rPr>
-        <w:t>Melhem levou a própria defesa para a internet.</w:t>
+        <w:t>Janeiro de dois mil e vinte e um.</w:t>
       </w:r>
     </w:p>
     <w:p>
@@ -199,7 +279,7 @@
         <w:rPr>
           <w:color w:val="000000"/>
         </w:rPr>
-        <w:t>No YouTube, ele publicou vídeos e mais vídeos sobre o caso. Mais de cem, ao longo dos anos. Neles, contestava as acusações e falava das mulheres que o acusavam.</w:t>
+        <w:t>Melhem entrou com uma ação contra Dani na Justiça de São Paulo.</w:t>
       </w:r>
     </w:p>
     <w:p>
@@ -207,7 +287,7 @@
         <w:rPr>
           <w:color w:val="000000"/>
         </w:rPr>
-        <w:t>Em vários deles, repetia a mesma ideia. Dizia que tinha sido vítima de uma execução pública, condenado pela imprensa sem nunca ter sido julgado.</w:t>
+        <w:t>Pedia duzentos mil reais por danos morais, valor que, segundo os advogados, seria doado à AACD. Pedia também uma retratação pública e o pagamento de um tratamento psiquiátrico. Somado, o pedido passava de duzentos e quarenta e seis mil reais.</w:t>
       </w:r>
     </w:p>
     <w:p>
@@ -215,7 +295,7 @@
         <w:rPr>
           <w:color w:val="000000"/>
         </w:rPr>
-        <w:t>Para os seguidores dele, era um homem lutando contra uma injustiça.</w:t>
+        <w:t>Dois meses depois, numa entrevista ao jornalista Ricardo Feltrin, do UOL, ele foi além.</w:t>
       </w:r>
     </w:p>
     <w:p>
@@ -223,7 +303,7 @@
         <w:rPr>
           <w:color w:val="000000"/>
         </w:rPr>
-        <w:t>Para algumas daquelas mulheres, segundo o que elas levaram depois à Justiça, aqueles vídeos eram outra forma de perseguição.</w:t>
+        <w:t>Disse que Dani mentia sobre o assédio. E apontou um motivo. Segundo Melhem, ela agia por vingança, depois que a direção da Globo recusou um projeto dela.</w:t>
       </w:r>
     </w:p>
     <w:p>
@@ -231,7 +311,7 @@
         <w:rPr>
           <w:color w:val="000000"/>
         </w:rPr>
-        <w:t>Enquanto isso, o inquérito seguia.</w:t>
+        <w:t>Era a versão dele. Uma acusação direta contra a mulher que o acusava.</w:t>
       </w:r>
     </w:p>
     <w:p>
@@ -239,7 +319,7 @@
         <w:rPr>
           <w:color w:val="000000"/>
         </w:rPr>
-        <w:t>Lembre das duas mil e quatrocentas páginas. Elas passaram pelas mãos de quatro delegados diferentes e de três promotores. Quase três anos de investigação.</w:t>
+        <w:t>Dani manteve o relato que tinha feito à revista.</w:t>
       </w:r>
     </w:p>
     <w:p>
@@ -247,7 +327,7 @@
         <w:rPr>
           <w:color w:val="000000"/>
         </w:rPr>
-        <w:t>Até que, no dia oito de agosto de dois mil e vinte e três, o Ministério Público do Rio de Janeiro apresentou a denúncia. Quem assinou foi a promotora Isabela Jourdan da Cruz Moura.</w:t>
+        <w:t>Em junho de dois mil e vinte e dois, a guerra das mensagens voltou com mais força. Pela coluna de Feltrin, veio a público um lote maior de conversas trocadas pelos dois entre dois mil e dezesseis e dois mil e dezenove.</w:t>
       </w:r>
     </w:p>
     <w:p>
@@ -255,7 +335,7 @@
         <w:rPr>
           <w:color w:val="000000"/>
         </w:rPr>
-        <w:t>O caso foi parar nas mãos da juíza Juliana Benevides de Barros Araújo.</w:t>
+        <w:t>Dani tentou impedir na Justiça que aquelas mensagens fossem expostas. Em agosto daquele ano, a queixa dela foi arquivada pela Justiça de São Paulo.</w:t>
       </w:r>
     </w:p>
     <w:p>
@@ -263,7 +343,7 @@
         <w:rPr>
           <w:color w:val="000000"/>
         </w:rPr>
-        <w:t>A Justiça aceitou.</w:t>
+        <w:t>Foi nesse mesmo período que veio a público o depoimento dela no processo.</w:t>
       </w:r>
     </w:p>
     <w:p>
@@ -271,7 +351,7 @@
         <w:rPr>
           <w:color w:val="000000"/>
         </w:rPr>
-        <w:t>Marcius Melhem virou réu por assédio sexual.</w:t>
+        <w:t>Segundo o relato publicado na imprensa, Dani explicou por que respondia às mensagens do chefe com simpatia. Disse que preferia entrar na brincadeira e manter o tom leve a comprar uma briga com o homem que comandava o departamento. Para ela, era a forma mais segura de continuar trabalhando.</w:t>
       </w:r>
     </w:p>
     <w:p>
@@ -279,7 +359,7 @@
         <w:rPr>
           <w:color w:val="000000"/>
         </w:rPr>
-        <w:t>A denúncia, porém, trazia uma surpresa.</w:t>
+        <w:t>Para a defesa dele, as mensagens mostravam uma amizade. Para ela, mostravam uma mulher tentando sobreviver no emprego.</w:t>
       </w:r>
     </w:p>
     <w:p>
@@ -287,7 +367,31 @@
         <w:rPr>
           <w:color w:val="000000"/>
         </w:rPr>
-        <w:t>Ela não falava de Dani Calabresa.</w:t>
+        <w:t>As mesmas conversas, lidas de dois jeitos opostos.</w:t>
+      </w:r>
+    </w:p>
+    <w:p>
+      <w:r>
+        <w:rPr>
+          <w:color w:val="000000"/>
+        </w:rPr>
+        <w:t>O processo de indenização terminou do jeito que menos gente esperava. A Justiça de São Paulo julgou o pedido de Melhem improcedente. Segundo o que foi publicado, a juíza entendeu que Dani não teve papel ativo na divulgação da reportagem, e por isso não devia indenizá-lo.</w:t>
+      </w:r>
+    </w:p>
+    <w:p>
+      <w:r>
+        <w:rPr>
+          <w:color w:val="000000"/>
+        </w:rPr>
+        <w:t>O pedido que Dani tinha feito contra ele, no mesmo processo, também foi negado.</w:t>
+      </w:r>
+    </w:p>
+    <w:p>
+      <w:r>
+        <w:rPr>
+          <w:color w:val="000000"/>
+        </w:rPr>
+        <w:t>Nenhum dos dois ganhou.</w:t>
       </w:r>
     </w:p>
     <w:p>
@@ -295,7 +399,7 @@
         <w:rPr>
           <w:color w:val="C00000"/>
         </w:rPr>
-        <w:t>Pare um segundo nessa informação. A mulher cuja denúncia tinha feito o Brasil inteiro conhecer esse caso, a primeira a levar a história para dentro da Globo, ficou de fora do processo. E o motivo tem a ver com um relógio que ninguém conseguiu parar.</w:t>
+        <w:t>E foi exatamente aí que a história mudou de nível. Porque, enquanto os dois brigavam por indenização, o Ministério Público do Rio de Janeiro investigava algo muito mais sério. E o resultado dessa investigação ia colocar Marcius Melhem, pela primeira vez, no banco dos réus.</w:t>
       </w:r>
     </w:p>
     <w:p>
@@ -303,7 +407,7 @@
         <w:rPr>
           <w:color w:val="000000"/>
         </w:rPr>
-        <w:t>O processo criminal seguiu com três mulheres. Duas atrizes e uma funcionária da emissora.</w:t>
+        <w:t>Durante quase três anos, promotores ouviram mulheres que tinham trabalhado no departamento de humor. Os depoimentos foram reunidos num processo que corria longe das câmeras.</w:t>
       </w:r>
     </w:p>
     <w:p>
@@ -311,7 +415,7 @@
         <w:rPr>
           <w:color w:val="000000"/>
         </w:rPr>
-        <w:t>Os casos de Dani e de outras mulheres foram arquivados.</w:t>
+        <w:t>Do lado de fora, pouca gente acompanhava os detalhes. O assunto tinha saído das manchetes.</w:t>
       </w:r>
     </w:p>
     <w:p>
@@ -319,7 +423,7 @@
         <w:rPr>
           <w:color w:val="000000"/>
         </w:rPr>
-        <w:t>O Ministério Público explicou por quê. Prescrição.</w:t>
+        <w:t>Até que uma decisão trouxe tudo de volta.</w:t>
       </w:r>
     </w:p>
     <w:p>
@@ -327,7 +431,23 @@
         <w:rPr>
           <w:color w:val="000000"/>
         </w:rPr>
-        <w:t>No Brasil, cada crime tem um prazo para ser punido. O crime de assédio sexual tem pena máxima de dois anos de prisão. Por isso, o Estado tem quatro anos para punir quem o cometeu. Depois disso, o caso não pode mais ser julgado.</w:t>
+        <w:t>Agosto de dois mil e vinte e três.</w:t>
+      </w:r>
+    </w:p>
+    <w:p>
+      <w:r>
+        <w:rPr>
+          <w:color w:val="1F4EB4"/>
+        </w:rPr>
+        <w:t>A Justiça do Rio de Janeiro aceitou a denúncia apresentada pelo Ministério Público. Marcius Melhem passou a ser réu por assédio sexual. A acusação falava em crimes cometidos de forma continuada contra três mulheres. As atrizes Carol Portes e Georgiana Góes, e uma funcionária que pediu para não ser identificada.</w:t>
+      </w:r>
+    </w:p>
+    <w:p>
+      <w:r>
+        <w:rPr>
+          <w:color w:val="1F4EB4"/>
+        </w:rPr>
+        <w:t>Só que existia um nome que não estava na lista. O de Dani Calabresa. A mulher que tinha começado tudo, que tinha levado o caso à direção da Globo e cujo relato abriu a reportagem, tinha ficado de fora do processo.</w:t>
       </w:r>
     </w:p>
     <w:p>
@@ -335,7 +455,7 @@
         <w:rPr>
           <w:color w:val="000000"/>
         </w:rPr>
-        <w:t>A festa do Zorra tinha acontecido em dois mil e dezessete.</w:t>
+        <w:t>O motivo era o tempo.</w:t>
       </w:r>
     </w:p>
     <w:p>
@@ -343,7 +463,7 @@
         <w:rPr>
           <w:color w:val="000000"/>
         </w:rPr>
-        <w:t>A denúncia chegou em dois mil e vinte e três.</w:t>
+        <w:t>Segundo a decisão, os fatos relatados por Dani e por outras mulheres tinham prescrito. A lei estabelece um prazo para que um crime seja levado à Justiça. Quando esse prazo passa, o Estado perde o direito de processar, sem que ninguém seja declarado culpado ou inocente.</w:t>
       </w:r>
     </w:p>
     <w:p>
@@ -351,7 +471,7 @@
         <w:rPr>
           <w:color w:val="000000"/>
         </w:rPr>
-        <w:t>Seis anos depois.</w:t>
+        <w:t>Pense no que isso significa.</w:t>
       </w:r>
     </w:p>
     <w:p>
@@ -359,7 +479,7 @@
         <w:rPr>
           <w:color w:val="000000"/>
         </w:rPr>
-        <w:t>O relógio já tinha corrido.</w:t>
+        <w:t>O relato que deu início a tudo nunca ia ser julgado.</w:t>
       </w:r>
     </w:p>
     <w:p>
@@ -367,7 +487,7 @@
         <w:rPr>
           <w:color w:val="000000"/>
         </w:rPr>
-        <w:t>Imagine o que isso significa para quem fez a denúncia. Você conta a sua história para a empresa e para a polícia. Espera anos. E descobre que o prazo para alguém responder por ela acabou enquanto o processo andava.</w:t>
+        <w:t>Melhem não seria condenado por aquela acusação. E também nunca teria a chance de ser absolvido por ela num tribunal.</w:t>
       </w:r>
     </w:p>
     <w:p>
@@ -375,7 +495,7 @@
         <w:rPr>
           <w:color w:val="000000"/>
         </w:rPr>
-        <w:t>Dani lamentou publicamente. Mas destacou uma coisa. Para ela, mesmo com a prescrição, o Ministério Público tinha reconhecido que o assédio aconteceu.</w:t>
+        <w:t>A defesa reagiu na hora. Os advogados afirmaram que a escolha da promotora responsável pela denúncia era ilegal, porque teria desrespeitado a regra que define qual promotor deve atuar em cada caso. E disseram que iam contestar a acusação até o fim.</w:t>
       </w:r>
     </w:p>
     <w:p>
@@ -383,7 +503,7 @@
         <w:rPr>
           <w:color w:val="000000"/>
         </w:rPr>
-        <w:t>Melhem, do outro lado, disse que as acusações eram infundadas, e que tinha provas para rebater cada uma delas.</w:t>
+        <w:t>Melhem continuou negando ter cometido qualquer crime.</w:t>
       </w:r>
     </w:p>
     <w:p>
@@ -391,7 +511,7 @@
         <w:rPr>
           <w:color w:val="000000"/>
         </w:rPr>
-        <w:t>Nesse meio tempo, ele também tinha ido à Justiça contra a própria Dani.</w:t>
+        <w:t>Segundo a denúncia, assinada pela promotora Isabela Jourdan, o ex-diretor teria usado a posição de chefe e a hierarquia do departamento para constranger as mulheres que trabalhavam sob o comando dele. A decisão de aceitar a acusação foi da juíza Juliana Benevides.</w:t>
       </w:r>
     </w:p>
     <w:p>
@@ -399,7 +519,7 @@
         <w:rPr>
           <w:color w:val="000000"/>
         </w:rPr>
-        <w:t>Pediu indenização por danos morais e materiais. E queria que ela se retratasse publicamente pelas acusações.</w:t>
+        <w:t>A defesa também levou o caso ao Supremo Tribunal Federal, tentando derrubar a forma como a acusação tinha sido feita.</w:t>
       </w:r>
     </w:p>
     <w:p>
@@ -407,7 +527,15 @@
         <w:rPr>
           <w:color w:val="000000"/>
         </w:rPr>
-        <w:t>Em fevereiro de dois mil e vinte e quatro, a Vigésima Segunda Vara Cível de São Paulo julgou o pedido improcedente. Segundo a decisão, Dani não tinha participado da divulgação do caso à imprensa, e por isso não podia ser responsabilizada. Um pedido de indenização feito por ela também foi negado.</w:t>
+        <w:t>Ser réu, é importante lembrar, significa responder a um processo. Ninguém é culpado antes de uma sentença.</w:t>
+      </w:r>
+    </w:p>
+    <w:p>
+      <w:r>
+        <w:rPr>
+          <w:color w:val="C00000"/>
+        </w:rPr>
+        <w:t>Dois meses depois, um velho amigo de Melhem decidiu se posicionar publicamente. Alguém que conhecia Marcius Melhem há mais tempo do que quase todo mundo nessa história.</w:t>
       </w:r>
     </w:p>
     <w:p>
@@ -415,7 +543,55 @@
         <w:rPr>
           <w:color w:val="000000"/>
         </w:rPr>
-        <w:t>Os advogados de Dani disseram que a decisão confirmava que ela agiu dentro da lei ao procurar o compliance da Globo. A defesa de Melhem anunciou que ia recorrer.</w:t>
+        <w:t>Outubro de dois mil e vinte e três.</w:t>
+      </w:r>
+    </w:p>
+    <w:p>
+      <w:r>
+        <w:rPr>
+          <w:color w:val="000000"/>
+        </w:rPr>
+        <w:t>Leandro Hassum.</w:t>
+      </w:r>
+    </w:p>
+    <w:p>
+      <w:r>
+        <w:rPr>
+          <w:color w:val="000000"/>
+        </w:rPr>
+        <w:t>O parceiro de Pedrão e Jorginho. O outro cara de pau.</w:t>
+      </w:r>
+    </w:p>
+    <w:p>
+      <w:r>
+        <w:rPr>
+          <w:color w:val="000000"/>
+        </w:rPr>
+        <w:t>Numa publicação nas redes sociais, Hassum disse que não podia ignorar os quinze anos que tinha passado trabalhando ao lado de Melhem.</w:t>
+      </w:r>
+    </w:p>
+    <w:p>
+      <w:r>
+        <w:rPr>
+          <w:color w:val="000000"/>
+        </w:rPr>
+        <w:t>Criticou parte das pessoas envolvidas no movimento em torno do caso, dizendo que algumas agiam por motivos egoístas. Afirmou que a questão tinha que ser resolvida pela Justiça, longe do espetáculo das redes.</w:t>
+      </w:r>
+    </w:p>
+    <w:p>
+      <w:r>
+        <w:rPr>
+          <w:color w:val="000000"/>
+        </w:rPr>
+        <w:t>Aproveitou para esclarecer uma coisa. Segundo ele, a dupla Os Caras de Pau tinha acabado em dois mil e doze por decisão da emissora. A relação entre os dois parceiros nunca tinha sido o motivo.</w:t>
+      </w:r>
+    </w:p>
+    <w:p>
+      <w:r>
+        <w:rPr>
+          <w:color w:val="000000"/>
+        </w:rPr>
+        <w:t>Agora a história tinha os dois parceiros mais importantes da vida de Melhem em lados opostos. Adnet ao lado de quem acusava. Hassum pedindo que a Justiça decidisse.</w:t>
       </w:r>
     </w:p>
     <w:p>
@@ -423,191 +599,7 @@
         <w:rPr>
           <w:color w:val="C00000"/>
         </w:rPr>
-        <w:t>Até aqui, parecia que a balança começava a pender para um lado. Mas o que aconteceu nos dois anos seguintes, dentro do próprio processo criminal, deixou muita gente sem saber o que pensar. E aconteceu de um jeito que quase ninguém esperava.</w:t>
-      </w:r>
-    </w:p>
-    <w:p>
-      <w:r>
-        <w:rPr>
-          <w:color w:val="000000"/>
-        </w:rPr>
-        <w:t>Maio de dois mil e vinte e cinco.</w:t>
-      </w:r>
-    </w:p>
-    <w:p>
-      <w:r>
-        <w:rPr>
-          <w:color w:val="000000"/>
-        </w:rPr>
-        <w:t>O processo contra Melhem estava andando.</w:t>
-      </w:r>
-    </w:p>
-    <w:p>
-      <w:r>
-        <w:rPr>
-          <w:color w:val="000000"/>
-        </w:rPr>
-        <w:t>Foi então que o promotor responsável pelo caso, Luís Augusto Soares de Andrade, do próprio Ministério Público do Rio, pediu o arquivamento da ação.</w:t>
-      </w:r>
-    </w:p>
-    <w:p>
-      <w:r>
-        <w:rPr>
-          <w:color w:val="000000"/>
-        </w:rPr>
-        <w:t>O argumento dele foi a inexistência de justa causa. Para esse promotor, não havia base suficiente para o processo continuar.</w:t>
-      </w:r>
-    </w:p>
-    <w:p>
-      <w:r>
-        <w:rPr>
-          <w:color w:val="000000"/>
-        </w:rPr>
-        <w:t>Pense nisso. O mesmo Ministério Público que tinha apresentado a denúncia agora, pela voz de outro promotor, pedia para encerrar o caso.</w:t>
-      </w:r>
-    </w:p>
-    <w:p>
-      <w:r>
-        <w:rPr>
-          <w:color w:val="000000"/>
-        </w:rPr>
-        <w:t>A juíza recusou. O processo seguiu, e as audiências foram marcadas para a primeira semana de agosto. Era a audiência em que acusação e defesa seriam ouvidas diante da juíza.</w:t>
-      </w:r>
-    </w:p>
-    <w:p>
-      <w:r>
-        <w:rPr>
-          <w:color w:val="C00000"/>
-        </w:rPr>
-        <w:t>Agora preste atenção no que aconteceu poucos dias antes dessas audiências. Porque quem mudou o rumo do processo, dessa vez, foi o próprio Marcius Melhem.</w:t>
-      </w:r>
-    </w:p>
-    <w:p>
-      <w:r>
-        <w:rPr>
-          <w:color w:val="1F4EB4"/>
-        </w:rPr>
-        <w:t>Vinte e quatro de julho de dois mil e vinte e cinco.</w:t>
-      </w:r>
-    </w:p>
-    <w:p>
-      <w:r>
-        <w:rPr>
-          <w:color w:val="1F4EB4"/>
-        </w:rPr>
-        <w:t>Durante anos, Melhem tinha repetido que queria ser julgado. Que só a Justiça podia provar a inocência dele.</w:t>
-      </w:r>
-    </w:p>
-    <w:p>
-      <w:r>
-        <w:rPr>
-          <w:color w:val="1F4EB4"/>
-        </w:rPr>
-        <w:t>Naquele mês, a defesa dele pediu ao Tribunal de Justiça do Rio que suspendesse o processo.</w:t>
-      </w:r>
-    </w:p>
-    <w:p>
-      <w:r>
-        <w:rPr>
-          <w:color w:val="1F4EB4"/>
-        </w:rPr>
-        <w:t>O pedido caiu nas mãos do desembargador Paulo Rangel. E ele concedeu. Na decisão, escreveu que era controversa a existência de justa causa para a acusação, já que o próprio Ministério Público tinha se manifestado contra a continuação do caso.</w:t>
-      </w:r>
-    </w:p>
-    <w:p>
-      <w:r>
-        <w:rPr>
-          <w:color w:val="1F4EB4"/>
-        </w:rPr>
-        <w:t>O processo foi suspenso.</w:t>
-      </w:r>
-    </w:p>
-    <w:p>
-      <w:r>
-        <w:rPr>
-          <w:color w:val="1F4EB4"/>
-        </w:rPr>
-        <w:t>A audiência de agosto, aquela em que acusação e defesa seriam ouvidas diante da juíza, foi retirada da agenda.</w:t>
-      </w:r>
-    </w:p>
-    <w:p>
-      <w:r>
-        <w:rPr>
-          <w:color w:val="1F4EB4"/>
-        </w:rPr>
-        <w:t>As mulheres que esperavam havia anos por esse momento ficaram, de novo, sem data.</w:t>
-      </w:r>
-    </w:p>
-    <w:p>
-      <w:r>
-        <w:rPr>
-          <w:color w:val="1F4EB4"/>
-        </w:rPr>
-        <w:t>E, sem tempo para respirar, veio o segundo golpe.</w:t>
-      </w:r>
-    </w:p>
-    <w:p>
-      <w:r>
-        <w:rPr>
-          <w:color w:val="1F4EB4"/>
-        </w:rPr>
-        <w:t>Abril de dois mil e vinte e seis.</w:t>
-      </w:r>
-    </w:p>
-    <w:p>
-      <w:r>
-        <w:rPr>
-          <w:color w:val="1F4EB4"/>
-        </w:rPr>
-        <w:t>A Justiça do Rio arquivou mais duas acusações contra Melhem, de fatos que teriam acontecido entre dois mil e catorze e dois mil e dezenove.</w:t>
-      </w:r>
-    </w:p>
-    <w:p>
-      <w:r>
-        <w:rPr>
-          <w:color w:val="1F4EB4"/>
-        </w:rPr>
-        <w:t>O motivo foi o mesmo relógio. Prescrição.</w:t>
-      </w:r>
-    </w:p>
-    <w:p>
-      <w:r>
-        <w:rPr>
-          <w:color w:val="1F4EB4"/>
-        </w:rPr>
-        <w:t>A decisão trazia uma frase que resume toda essa história. A juíza deixou claro que aquele arquivamento não avaliava se tinha havido assédio ou não.</w:t>
-      </w:r>
-    </w:p>
-    <w:p>
-      <w:r>
-        <w:rPr>
-          <w:color w:val="1F4EB4"/>
-        </w:rPr>
-        <w:t>Ninguém foi declarado inocente. Ninguém foi declarado culpado. O tempo simplesmente acabou.</w:t>
-      </w:r>
-    </w:p>
-    <w:p>
-      <w:r>
-        <w:rPr>
-          <w:color w:val="1F4EB4"/>
-        </w:rPr>
-        <w:t>Das sete mulheres que chegaram a acusar Marcius Melhem no processo, a Justiça nunca chegou a julgar o que seis delas contaram.</w:t>
-      </w:r>
-    </w:p>
-    <w:p>
-      <w:r>
-        <w:rPr>
-          <w:color w:val="1F4EB4"/>
-        </w:rPr>
-        <w:t>Restava uma única acusação. Fatos de dois mil e dezenove e dois mil e vinte.</w:t>
-      </w:r>
-    </w:p>
-    <w:p>
-      <w:r>
-        <w:rPr>
-          <w:color w:val="1F4EB4"/>
-        </w:rPr>
-        <w:t>O fim dessa última acusação é a parte mais difícil de engolir de toda essa história. Porque ela terminou com um valor. Um valor que você vai ouvir agora e que fez o Brasil inteiro voltar a falar de Marcius Melhem, há poucos dias.</w:t>
+        <w:t>Só que a Justiça ainda ia surpreender todo mundo. Porque, quase dois anos depois, o próprio Ministério Público que tinha acusado Melhem ia pedir uma coisa que ninguém esperava. E a resposta da juíza a esse pedido ia mudar o rumo do caso outra vez.</w:t>
       </w:r>
     </w:p>
     <w:sectPr>

</xml_diff>